<commit_message>
docs(education): detail individual oral defense evidence
</commit_message>
<xml_diff>
--- a/education/evidencias_abet/PLANTILLA_EVIDENCIA_ABET_TALLER_URDF_TF.docx
+++ b/education/evidencias_abet/PLANTILLA_EVIDENCIA_ABET_TALLER_URDF_TF.docx
@@ -1869,7 +1869,7 @@
                 <w:b w:val="0"/>
                 <w:sz w:val="16"/>
               </w:rPr>
-              <w:t>E8</w:t>
+              <w:t>E8, E9 y E10</w:t>
             </w:r>
           </w:p>
         </w:tc>
@@ -1979,7 +1979,7 @@
                 <w:b w:val="0"/>
                 <w:sz w:val="16"/>
               </w:rPr>
-              <w:t>E8</w:t>
+              <w:t>E11</w:t>
             </w:r>
           </w:p>
         </w:tc>
@@ -2507,7 +2507,172 @@
                 <w:b w:val="0"/>
                 <w:sz w:val="16"/>
               </w:rPr>
-              <w:t>Registro del evaluador de la sustentación oral individual: preguntas formuladas, síntesis de respuestas, verificación de autoría y resultado del reto de diagnóstico en vivo.</w:t>
+              <w:t>Registro del evaluador de la sustentación oral individual: asistencia, verificación de identidad y autoría, fecha, duración y observaciones.</w:t>
+            </w:r>
+          </w:p>
+        </w:tc>
+        <w:tc>
+          <w:tcPr>
+            <w:tcW w:type="dxa" w:w="3570"/>
+            <w:vAlign w:val="center"/>
+          </w:tcPr>
+          <w:p>
+            <w:pPr>
+              <w:spacing w:after="0"/>
+            </w:pPr>
+            <w:r>
+              <w:rPr>
+                <w:b w:val="0"/>
+                <w:sz w:val="16"/>
+              </w:rPr>
+            </w:r>
+          </w:p>
+        </w:tc>
+      </w:tr>
+      <w:tr>
+        <w:tc>
+          <w:tcPr>
+            <w:tcW w:type="dxa" w:w="3570"/>
+            <w:vAlign w:val="center"/>
+          </w:tcPr>
+          <w:p>
+            <w:pPr>
+              <w:spacing w:after="0"/>
+            </w:pPr>
+            <w:r>
+              <w:rPr>
+                <w:b w:val="0"/>
+                <w:sz w:val="16"/>
+              </w:rPr>
+              <w:t>E9</w:t>
+            </w:r>
+          </w:p>
+        </w:tc>
+        <w:tc>
+          <w:tcPr>
+            <w:tcW w:type="dxa" w:w="3570"/>
+            <w:vAlign w:val="center"/>
+          </w:tcPr>
+          <w:p>
+            <w:pPr>
+              <w:spacing w:after="0"/>
+            </w:pPr>
+            <w:r>
+              <w:rPr>
+                <w:b w:val="0"/>
+                <w:sz w:val="16"/>
+              </w:rPr>
+              <w:t>Respuesta oral individual: explique el flujo URDF/XACRO -&gt; robot_description -&gt; robot_state_publisher -&gt; tf/tf_static y localice la evidencia correspondiente en su entrega.</w:t>
+            </w:r>
+          </w:p>
+        </w:tc>
+        <w:tc>
+          <w:tcPr>
+            <w:tcW w:type="dxa" w:w="3570"/>
+            <w:vAlign w:val="center"/>
+          </w:tcPr>
+          <w:p>
+            <w:pPr>
+              <w:spacing w:after="0"/>
+            </w:pPr>
+            <w:r>
+              <w:rPr>
+                <w:b w:val="0"/>
+                <w:sz w:val="16"/>
+              </w:rPr>
+            </w:r>
+          </w:p>
+        </w:tc>
+      </w:tr>
+      <w:tr>
+        <w:tc>
+          <w:tcPr>
+            <w:tcW w:type="dxa" w:w="3570"/>
+            <w:vAlign w:val="center"/>
+          </w:tcPr>
+          <w:p>
+            <w:pPr>
+              <w:spacing w:after="0"/>
+            </w:pPr>
+            <w:r>
+              <w:rPr>
+                <w:b w:val="0"/>
+                <w:sz w:val="16"/>
+              </w:rPr>
+              <w:t>E10</w:t>
+            </w:r>
+          </w:p>
+        </w:tc>
+        <w:tc>
+          <w:tcPr>
+            <w:tcW w:type="dxa" w:w="3570"/>
+            <w:vAlign w:val="center"/>
+          </w:tcPr>
+          <w:p>
+            <w:pPr>
+              <w:spacing w:after="0"/>
+            </w:pPr>
+            <w:r>
+              <w:rPr>
+                <w:b w:val="0"/>
+                <w:sz w:val="16"/>
+              </w:rPr>
+              <w:t>Respuesta oral individual: interprete una relación entre frames, origin xyz/rpy, links/joints y publicación estática o dinámica; justifique una decisión del modelo Burger Delivery.</w:t>
+            </w:r>
+          </w:p>
+        </w:tc>
+        <w:tc>
+          <w:tcPr>
+            <w:tcW w:type="dxa" w:w="3570"/>
+            <w:vAlign w:val="center"/>
+          </w:tcPr>
+          <w:p>
+            <w:pPr>
+              <w:spacing w:after="0"/>
+            </w:pPr>
+            <w:r>
+              <w:rPr>
+                <w:b w:val="0"/>
+                <w:sz w:val="16"/>
+              </w:rPr>
+            </w:r>
+          </w:p>
+        </w:tc>
+      </w:tr>
+      <w:tr>
+        <w:tc>
+          <w:tcPr>
+            <w:tcW w:type="dxa" w:w="3570"/>
+            <w:vAlign w:val="center"/>
+          </w:tcPr>
+          <w:p>
+            <w:pPr>
+              <w:spacing w:after="0"/>
+            </w:pPr>
+            <w:r>
+              <w:rPr>
+                <w:b w:val="0"/>
+                <w:sz w:val="16"/>
+              </w:rPr>
+              <w:t>E11</w:t>
+            </w:r>
+          </w:p>
+        </w:tc>
+        <w:tc>
+          <w:tcPr>
+            <w:tcW w:type="dxa" w:w="3570"/>
+            <w:vAlign w:val="center"/>
+          </w:tcPr>
+          <w:p>
+            <w:pPr>
+              <w:spacing w:after="0"/>
+            </w:pPr>
+            <w:r>
+              <w:rPr>
+                <w:b w:val="0"/>
+                <w:sz w:val="16"/>
+              </w:rPr>
+              <w:t>Reto de diagnóstico en vivo: registre el escenario planteado, hipótesis, prueba propuesta, resultado interpretado y corrección siguiendo Sintaxis -&gt; TF -&gt; Red -&gt; Lógica.</w:t>
             </w:r>
           </w:p>
         </w:tc>
@@ -4294,7 +4459,7 @@
         <w:t xml:space="preserve">Evidencia: </w:t>
       </w:r>
       <w:r>
-        <w:t>E8</w:t>
+        <w:t>E8, E9 y E10</w:t>
       </w:r>
     </w:p>
     <w:tbl>
@@ -4866,7 +5031,7 @@
         <w:t xml:space="preserve">Evidencia: </w:t>
       </w:r>
       <w:r>
-        <w:t>E8</w:t>
+        <w:t>E11</w:t>
       </w:r>
     </w:p>
     <w:tbl>

</xml_diff>